<commit_message>
Monitoring intégré + dossier réaligné (RGPD, budget, cible vs MVP) + Q&A jury
- App : nouvel onglet Suivi & monitoring (qualité données, résultats modèle, usage anonyme)
- Dossier docx : sections RGPD (ch.11), Budget (ch.12), mise au point architecture cible vs MVP livré (ch.13) ; MLflow reclassé en cible, monitoring réel décrit
- Présentation : slides Conformité RGPD et Budget avant Merci
- README : RGPD + monitoring ; PREPARE_JURY.md (Q&A soutenance)
</commit_message>
<xml_diff>
--- a/docs/Dossier_Projet_Bornes_VE.docx
+++ b/docs/Dossier_Projet_Bornes_VE.docx
@@ -132,6 +132,21 @@
     <w:p>
       <w:r>
         <w:t>10. Comment on saura que c'est réussi</w:t>
+      </w:r>
+    </w:p>
+    <w:p>
+      <w:r>
+        <w:t>11. Conformité RGPD et protection des données</w:t>
+      </w:r>
+    </w:p>
+    <w:p>
+      <w:r>
+        <w:t>12. Budget et coûts du projet</w:t>
+      </w:r>
+    </w:p>
+    <w:p>
+      <w:r>
+        <w:t>13. Architecture cible vs MVP réellement livré</w:t>
       </w:r>
     </w:p>
     <w:p>
@@ -1167,6 +1182,12 @@
       </w:r>
     </w:p>
     <w:p>
+      <w:pPr/>
+      <w:r>
+        <w:t>Deux niveaux de lecture. Ce chapitre décrit d'abord l'architecture CIBLE du projet d'équipe (la vision complète, à 4 personnes). Le MVP réellement déployé et présenté au jury est plus resserré et 100 % autonome : il est détaillé au chapitre 13. On garde les deux pour montrer à la fois l'ambition d'industrialisation et ce qui tourne vraiment en ligne.</w:t>
+      </w:r>
+    </w:p>
+    <w:p>
       <w:pPr>
         <w:spacing w:after="120"/>
       </w:pPr>
@@ -1547,7 +1568,7 @@
         <w:spacing w:after="120"/>
       </w:pPr>
       <w:r>
-        <w:t>On déploie chacun des 3 services (serveur MLflow, API, dashboard) comme un Space Hugging Face séparé. C'est gratuit pour les petites tailles, ça donne une URL publique stable, et ça évite de gérer un serveur. Les secrets (clés AWS, URL Neon) sont mis dans les variables d'environnement du Space, pas dans le code.</w:t>
+        <w:t>Dans l'architecture cible, on déploierait chacun des 3 services (serveur MLflow, API, dashboard) comme un Space Hugging Face séparé. C'est gratuit pour les petites tailles et ça donne une URL publique par service. Dans le MVP livré (chapitre 13), on a fait plus simple : un seul Space qui héberge le dashboard autonome.</w:t>
       </w:r>
     </w:p>
     <w:p>
@@ -1665,7 +1686,7 @@
         <w:spacing w:after="120"/>
       </w:pPr>
       <w:r>
-        <w:t>Un script Python qu'on peut lancer en local, dans un Docker, ou via la commande mlflow run. Il produit les 15 combinaisons (3 scénarios × 5 horizons) et les trace dans MLflow.</w:t>
+        <w:t>Un script Python qu'on peut lancer en local ou dans un Docker. Il produit les 15 combinaisons (3 scénarios × 5 horizons) et enregistre les résultats (déficit de bornes, énergie additionnelle) qui alimentent le dashboard.</w:t>
       </w:r>
     </w:p>
     <w:p>
@@ -1714,7 +1735,7 @@
         <w:rPr>
           <w:color w:val="1F3A68"/>
         </w:rPr>
-        <w:t>7.4 La traçabilité MLflow</w:t>
+        <w:t>7.4 Le suivi et le monitoring</w:t>
       </w:r>
     </w:p>
     <w:p>
@@ -1722,7 +1743,7 @@
         <w:spacing w:after="120"/>
       </w:pPr>
       <w:r>
-        <w:t>Chaque exécution du pipeline produit 15 runs consultables dans MLflow. Pour chaque run on retrouve les paramètres (scénario, horizon, P*, date du snapshot), les métriques (déficit total de Paris, nombre d'arrondissements critiques, pression moyenne projetée), et les fichiers produits.</w:t>
+        <w:t>Le MVP embarque une page de monitoring intégrée à l'application (onglet « Suivi &amp; monitoring »), plutôt qu'un serveur MLflow externe. Elle suit trois familles d'indicateurs : la fraîcheur et la qualité des données (nombre de bornes chargées, 20 arrondissements couverts, complétude des coordonnées, contrôles automatiques), les résultats du modèle (les 15 combinaisons scénario × horizon et leur déficit projeté), et l'usage de l'application (compteur de visites anonyme). MLflow reste la brique de tracking de l'architecture cible si le projet est industrialisé.</w:t>
       </w:r>
     </w:p>
     <w:p>
@@ -2661,6 +2682,261 @@
       </w:pPr>
       <w:r>
         <w:t>Si on avait plus de temps après le projet, on pourrait : raffiner le choix des emplacements en tenant compte du type de voirie et de la proximité d'un raccordement électrique ; recaler les scénarios avec un vrai modèle économétrique qui prend en compte le prix du carburant et la composition du parc ; ajouter une dimension temporelle fine (saisonnalité) pour dimensionner non seulement le nombre de bornes mais aussi leur puissance.</w:t>
+      </w:r>
+    </w:p>
+    <w:p>
+      <w:pPr>
+        <w:pStyle w:val="Titre1"/>
+      </w:pPr>
+      <w:r>
+        <w:t>11. Conformité RGPD et protection des données</w:t>
+      </w:r>
+    </w:p>
+    <w:p>
+      <w:r>
+        <w:t>Le projet a été pensé pour être conforme au RGPD par construction (privacy by design). Le point clé est simple : on ne traite aucune donnée personnelle.</w:t>
+      </w:r>
+    </w:p>
+    <w:p>
+      <w:pPr>
+        <w:pStyle w:val="Titre2"/>
+      </w:pPr>
+      <w:r>
+        <w:t>11.1 Aucune donnée personnelle</w:t>
+      </w:r>
+    </w:p>
+    <w:p>
+      <w:r>
+        <w:t>Toutes les données sont ouvertes, publiques et agrégées : bornes Belib' (OpenData Ville de Paris), parc de véhicules électriques par arrondissement (SDES / data.gouv.fr), consommation électrique agrégée (Enedis), population par arrondissement (INSEE). Aucune de ces sources ne contient de donnée à caractère personnel : pas de nom, pas d'immatriculation individuelle, pas d'adresse d'usager. Tout est agrégé à la maille de l'arrondissement (20 zones), jamais à l'individu.</w:t>
+      </w:r>
+    </w:p>
+    <w:p>
+      <w:pPr>
+        <w:pStyle w:val="Titre2"/>
+      </w:pPr>
+      <w:r>
+        <w:t>11.2 Aucun traçage utilisateur</w:t>
+      </w:r>
+    </w:p>
+    <w:p>
+      <w:r>
+        <w:t>L'application ne dépose aucun cookie, ne demande aucune authentification et ne collecte aucune donnée identifiante sur ses visiteurs. Le seul suivi d'usage est un compteur de visites anonyme (horodatage serveur), sans IP ni identifiant, non rattachable à une personne. Il n'y a donc pas de traitement de données personnelles au sens de l'article 4 du RGPD.</w:t>
+      </w:r>
+    </w:p>
+    <w:p>
+      <w:pPr>
+        <w:pStyle w:val="Titre2"/>
+      </w:pPr>
+      <w:r>
+        <w:t>11.3 Sources et licences ouvertes</w:t>
+      </w:r>
+    </w:p>
+    <w:p>
+      <w:r>
+        <w:t>Les jeux de données sont diffusés sous licences ouvertes (Licence Ouverte Etalab / ODbL) via opendata.paris.fr et data.gouv.fr. Leur réutilisation, y compris pour de l'aide à la décision publique, est explicitement autorisée. Les sources sont citées dans le dashboard et le dépôt.</w:t>
+      </w:r>
+    </w:p>
+    <w:p>
+      <w:pPr>
+        <w:pStyle w:val="Titre2"/>
+      </w:pPr>
+      <w:r>
+        <w:t>11.4 Principes CNIL appliqués</w:t>
+      </w:r>
+    </w:p>
+    <w:p>
+      <w:r>
+        <w:t>Comme aucune donnée personnelle n'est traitée, le projet n'a pas à tenir de registre des traitements ni à désigner un DPO. On applique tout de même les principes de la CNIL : minimisation (on ne garde que l'agrégat utile), transparence (sources ouvertes et code public), sécurité (aucun secret dans le dépôt Git, base reconstruite à la volée depuis les sources publiques). Si un jour on croisait des données individuelles (trajets réels d'usagers, par exemple), une analyse d'impact (AIPD/PIA) deviendrait nécessaire.</w:t>
+      </w:r>
+    </w:p>
+    <w:p>
+      <w:pPr>
+        <w:pStyle w:val="Titre1"/>
+      </w:pPr>
+      <w:r>
+        <w:t>12. Budget et coûts du projet</w:t>
+      </w:r>
+    </w:p>
+    <w:p>
+      <w:r>
+        <w:t>On distingue deux budgets : le coût de la solution data (l'outil qu'on livre) et un budget indicatif du déploiement métier (ce que coûterait, côté Ville, l'installation réelle des bornes que l'outil recommande).</w:t>
+      </w:r>
+    </w:p>
+    <w:p>
+      <w:pPr>
+        <w:pStyle w:val="Titre2"/>
+      </w:pPr>
+      <w:r>
+        <w:t>12.1 Coût de la solution data (MVP livré)</w:t>
+      </w:r>
+    </w:p>
+    <w:p>
+      <w:pPr>
+        <w:pStyle w:val="Listepuces"/>
+      </w:pPr>
+      <w:r>
+        <w:t>Hébergement : Hugging Face Spaces, offre gratuite (CPU basic, 16 Go RAM) — 0 €/mois. Une montée en gamme optionnelle (CPU upgrade ou stockage persistant) coûterait de l'ordre de 0,03 à 0,09 $/h, soit quelques euros par mois si activée en continu — non nécessaire pour le MVP.</w:t>
+      </w:r>
+    </w:p>
+    <w:p>
+      <w:pPr>
+        <w:pStyle w:val="Listepuces"/>
+      </w:pPr>
+      <w:r>
+        <w:t>Données : 100 % OpenData — 0 €.</w:t>
+      </w:r>
+    </w:p>
+    <w:p>
+      <w:pPr>
+        <w:pStyle w:val="Listepuces"/>
+      </w:pPr>
+      <w:r>
+        <w:t>Code et intégration continue : GitHub public — 0 €.</w:t>
+      </w:r>
+    </w:p>
+    <w:p>
+      <w:pPr>
+        <w:pStyle w:val="Listepuces"/>
+      </w:pPr>
+      <w:r>
+        <w:t>Coût humain (projet école) : équipe de 4 sur ~4-5 jours, soit ~15-20 jours-homme.</w:t>
+      </w:r>
+    </w:p>
+    <w:p>
+      <w:r>
+        <w:t>Total d'exploitation : environ 0 €/mois. C'est un choix assumé : rester sur des briques gratuites et reproductibles, sans secret ni service payant.</w:t>
+      </w:r>
+    </w:p>
+    <w:p>
+      <w:pPr>
+        <w:pStyle w:val="Titre2"/>
+      </w:pPr>
+      <w:r>
+        <w:t>12.2 Budget indicatif du déploiement métier (ordre de grandeur)</w:t>
+      </w:r>
+    </w:p>
+    <w:p>
+      <w:pPr>
+        <w:pStyle w:val="Listepuces"/>
+      </w:pPr>
+      <w:r>
+        <w:t>Installation d'une borne sur voirie : environ 10 000 à 15 000 € par point de charge (matériel, génie civil, raccordement Enedis). Les bornes rapides (DC, 50 kW et plus) montent à 30 000 - 50 000 €.</w:t>
+      </w:r>
+    </w:p>
+    <w:p>
+      <w:pPr>
+        <w:pStyle w:val="Listepuces"/>
+      </w:pPr>
+      <w:r>
+        <w:t>Maintenance et supervision : de l'ordre de 500 à 1 500 € par borne et par an (5 à 10 % de l'investissement).</w:t>
+      </w:r>
+    </w:p>
+    <w:p>
+      <w:pPr>
+        <w:pStyle w:val="Listepuces"/>
+      </w:pPr>
+      <w:r>
+        <w:t>Énergie : coût de l'électricité refacturée à l'usage, à la charge de l'opérateur ou de l'usager.</w:t>
+      </w:r>
+    </w:p>
+    <w:p>
+      <w:r>
+        <w:t>Ordre de grandeur du rollout : le scénario central projette un déficit d'environ 7 600 bornes à 3 ans pour Paris. À ~12 000 € la borne, cela représente un investissement de l'ordre de 90 M€ sur 3 ans (~30 M€/an). L'intérêt de l'outil est précisément de prioriser cet investissement — quels arrondissements d'abord — plutôt que de l'étaler à l'aveugle.</w:t>
+      </w:r>
+    </w:p>
+    <w:p>
+      <w:pPr>
+        <w:pStyle w:val="Titre2"/>
+      </w:pPr>
+      <w:r>
+        <w:t>12.3 Ce que le budget démontre</w:t>
+      </w:r>
+    </w:p>
+    <w:p>
+      <w:r>
+        <w:t>Le coût marginal de l'outil d'aide à la décision (~0 €) est négligeable devant l'enjeu qu'il aide à piloter (des dizaines de M€). C'est le meilleur argument de retour sur investissement : quelques jours de data pour mieux orienter des dizaines de millions d'euros d'investissement public.</w:t>
+      </w:r>
+    </w:p>
+    <w:p>
+      <w:pPr>
+        <w:pStyle w:val="Titre1"/>
+      </w:pPr>
+      <w:r>
+        <w:t>13. Architecture cible vs MVP réellement livré (mise au point)</w:t>
+      </w:r>
+    </w:p>
+    <w:p>
+      <w:r>
+        <w:t>Les chapitres 5 à 7 décrivent l'architecture cible d'un projet d'équipe complet (Airflow, S3, base Neon, serveur MLflow, API FastAPI, trois Spaces Hugging Face). Par honnêteté vis-à-vis du jury, voici ce qui a été effectivement déployé et démontré.</w:t>
+      </w:r>
+    </w:p>
+    <w:p>
+      <w:pPr>
+        <w:pStyle w:val="Titre2"/>
+      </w:pPr>
+      <w:r>
+        <w:t>13.1 Ce qui est réellement livré et en ligne</w:t>
+      </w:r>
+    </w:p>
+    <w:p>
+      <w:pPr>
+        <w:pStyle w:val="Listepuces"/>
+      </w:pPr>
+      <w:r>
+        <w:t>Données : récupération directe depuis l'OpenData Ville de Paris (API Belib'), sans authentification ni secret.</w:t>
+      </w:r>
+    </w:p>
+    <w:p>
+      <w:pPr>
+        <w:pStyle w:val="Listepuces"/>
+      </w:pPr>
+      <w:r>
+        <w:t>Stockage : une base SQLite (bornes.db) reconstruite à la volée depuis les sources publiques.</w:t>
+      </w:r>
+    </w:p>
+    <w:p>
+      <w:pPr>
+        <w:pStyle w:val="Listepuces"/>
+      </w:pPr>
+      <w:r>
+        <w:t>Application : un dashboard Streamlit unique (cartes, pression, projections, soutenabilité, page de monitoring).</w:t>
+      </w:r>
+    </w:p>
+    <w:p>
+      <w:pPr>
+        <w:pStyle w:val="Listepuces"/>
+      </w:pPr>
+      <w:r>
+        <w:t>Empaquetage : un Dockerfile.</w:t>
+      </w:r>
+    </w:p>
+    <w:p>
+      <w:pPr>
+        <w:pStyle w:val="Listepuces"/>
+      </w:pPr>
+      <w:r>
+        <w:t>Déploiement : un seul Hugging Face Space public (Alh92500/paris-bornes), avec le code sur GitHub.</w:t>
+      </w:r>
+    </w:p>
+    <w:p>
+      <w:pPr>
+        <w:pStyle w:val="Listepuces"/>
+      </w:pPr>
+      <w:r>
+        <w:t>Monitoring : une page de suivi intégrée à l'application (qualité des données, résultats du modèle, usage).</w:t>
+      </w:r>
+    </w:p>
+    <w:p>
+      <w:pPr>
+        <w:pStyle w:val="Titre2"/>
+      </w:pPr>
+      <w:r>
+        <w:t>13.2 Pourquoi ce choix</w:t>
+      </w:r>
+    </w:p>
+    <w:p>
+      <w:r>
+        <w:t>La consigne du bloc invite à privilégier quelque chose de robuste et reproductible plutôt qu'une automatisation fragile. Un dashboard autonome, sans dépendance à des services payants ni à des secrets, se relance partout en une commande et ne tombe pas en panne le jour de la soutenance. Les briques de l'architecture cible (Airflow, S3, MLflow, FastAPI) restent la trajectoire d'industrialisation si le projet passait à l'échelle.</w:t>
       </w:r>
     </w:p>
     <w:sectPr>

</xml_diff>